<commit_message>
fix: quebra de linha de tabelas
</commit_message>
<xml_diff>
--- a/Modelos/definitivos/Datasheet.docx
+++ b/Modelos/definitivos/Datasheet.docx
@@ -811,6 +811,10 @@
         <w:gridCol w:w="10456"/>
       </w:tblGrid>
       <w:tr>
+        <w:trPr>
+          <w:cantSplit/>
+          <w:tblHeader/>
+        </w:trPr>
         <w:tc>
           <w:tcPr>
             <w:tcW w:w="10456" w:type="dxa"/>
@@ -839,6 +843,11 @@
         </w:tc>
       </w:tr>
       <w:tr>
+        <w:trPr>
+          <w:cantSplit/>
+          <w:trHeight w:val="715"/>
+          <w:tblHeader/>
+        </w:trPr>
         <w:tc>
           <w:tcPr>
             <w:tcW w:w="10456" w:type="dxa"/>

</xml_diff>